<commit_message>
2. Abbildung detailreicher und Zwischenbericht angepasst
</commit_message>
<xml_diff>
--- a/report/entwuerfe/2_Zwischenstand_Jann_Koerner_bearbeitbar.docx
+++ b/report/entwuerfe/2_Zwischenstand_Jann_Koerner_bearbeitbar.docx
@@ -139,55 +139,6 @@
         <w:t>Dieser Zwischenstand dokumentiert Screenshots einer kompilierten Elm-Anwendung. Die drei SVG-Ansichten sind über ein gemeinsames Model interaktiv verbunden. Auswahländerungen in einer Ansicht aktualisieren die beiden anderen Ansichten.</w:t>
       </w:r>
     </w:p>
-    <w:tbl>
-      <w:tblPr>
-        <w:tblStyle w:val="Tabellenraster"/>
-        <w:tblW w:w="9360" w:type="dxa"/>
-        <w:tblInd w:w="120" w:type="dxa"/>
-        <w:tblLayout w:type="fixed"/>
-        <w:tblLook w:val="04A0" w:firstRow="1" w:lastRow="0" w:firstColumn="1" w:lastColumn="0" w:noHBand="0" w:noVBand="1"/>
-      </w:tblPr>
-      <w:tblGrid>
-        <w:gridCol w:w="9360"/>
-      </w:tblGrid>
-      <w:tr>
-        <w:tc>
-          <w:tcPr>
-            <w:tcW w:w="9360" w:type="dxa"/>
-            <w:shd w:val="clear" w:color="auto" w:fill="F8F9FB"/>
-            <w:tcMar>
-              <w:top w:w="80" w:type="dxa"/>
-              <w:left w:w="120" w:type="dxa"/>
-              <w:bottom w:w="80" w:type="dxa"/>
-              <w:right w:w="120" w:type="dxa"/>
-            </w:tcMar>
-          </w:tcPr>
-          <w:p>
-            <w:pPr>
-              <w:spacing w:after="80"/>
-            </w:pPr>
-            <w:r>
-              <w:rPr>
-                <w:b/>
-                <w:color w:val="4F8A4A"/>
-              </w:rPr>
-              <w:t>Datenbankstatus</w:t>
-            </w:r>
-          </w:p>
-          <w:p>
-            <w:pPr>
-              <w:spacing w:after="0"/>
-            </w:pPr>
-            <w:r>
-              <w:rPr>
-                <w:sz w:val="19"/>
-              </w:rPr>
-              <w:t>Der Datensatz wurde über die ScienceData-PostgREST-Schnittstelle aus dem Schema energycharts exportiert. Verwendet werden die Views v_cbpf, v_cbet, v_price und v_totalpower. Alle Abfragen sind auf Deutschland beziehungsweise DE-LU, den Zeitraum 01.-02.01.2025 und feste Zeilenlimits beschränkt. Passwort und Token sind nicht Bestandteil des Repositories.</w:t>
-            </w:r>
-          </w:p>
-        </w:tc>
-      </w:tr>
-    </w:tbl>
     <w:p>
       <w:pPr>
         <w:spacing w:after="0"/>
@@ -262,8 +213,19 @@
         <w:pStyle w:val="Aufzhlungszeichen"/>
       </w:pPr>
       <w:r>
-        <w:t>Anhang: Git-Historie und KI-Unterstützung</w:t>
+        <w:t>Git</w:t>
       </w:r>
+      <w:r>
+        <w:t>Hub</w:t>
+      </w:r>
+      <w:r>
+        <w:t xml:space="preserve"> und KI-</w:t>
+      </w:r>
+      <w:proofErr w:type="spellStart"/>
+      <w:r>
+        <w:t>Unterstützung</w:t>
+      </w:r>
+      <w:proofErr w:type="spellEnd"/>
     </w:p>
     <w:p>
       <w:pPr>
@@ -309,11 +271,15 @@
     </w:p>
     <w:p>
       <w:r>
-        <w:t xml:space="preserve">Primäre Zielgruppe sind Datenjournalist:innen in deutschsprachigen Energie- und Klimaredaktionen. Vorausgesetzt werden Grundkenntnisse zu europäischen Ländern, Leistung in GW, Energie in GWh </w:t>
+        <w:t xml:space="preserve">Primäre Zielgruppe sind Datenjournalist:innen in deutschsprachigen Energie- und Klimaredaktionen. Vorausgesetzt werden Grundkenntnisse zu europäischen Ländern, Leistung in GW, Energie in GWh und </w:t>
       </w:r>
+      <w:proofErr w:type="spellStart"/>
       <w:r>
-        <w:lastRenderedPageBreak/>
-        <w:t>und Zeitreihen. SQL- oder API-Kenntnisse sind nicht erforderlich. Die Anwendung soll dominante Austauschbeziehungen, Richtungswechsel und auffällige Perioden sichtbar machen und mit dem zeitgleichen Erzeugungsmix kontextualisieren.</w:t>
+        <w:t>Zeitreihen</w:t>
+      </w:r>
+      <w:proofErr w:type="spellEnd"/>
+      <w:r>
+        <w:t>. Die Anwendung soll dominante Austauschbeziehungen, Richtungswechsel und auffällige Perioden sichtbar machen und mit dem zeitgleichen Erzeugungsmix kontextualisieren.</w:t>
       </w:r>
     </w:p>
     <w:p>
@@ -321,6 +287,7 @@
         <w:pStyle w:val="berschrift2"/>
       </w:pPr>
       <w:r>
+        <w:lastRenderedPageBreak/>
         <w:t>1.3 Überblick und Beiträge</w:t>
       </w:r>
     </w:p>
@@ -1230,7 +1197,7 @@
           <w:noProof/>
         </w:rPr>
         <w:drawing>
-          <wp:inline distT="0" distB="0" distL="0" distR="0" wp14:anchorId="14C38D17" wp14:editId="2D0860B5">
+          <wp:inline distT="0" distB="0" distL="0" distR="0" wp14:anchorId="31552F06" wp14:editId="2BF9B86C">
             <wp:extent cx="3960000" cy="3774501"/>
             <wp:effectExtent l="0" t="0" r="0" b="0"/>
             <wp:docPr id="1" name="Picture 1" descr="Elm-SVG der gerichteten Stromflüsse zwischen Deutschland und Partnerländern"/>
@@ -1299,10 +1266,10 @@
           <w:noProof/>
         </w:rPr>
         <w:drawing>
-          <wp:inline distT="0" distB="0" distL="0" distR="0" wp14:anchorId="3572BFD2" wp14:editId="0E359A62">
-            <wp:extent cx="5472000" cy="3627331"/>
+          <wp:inline distT="0" distB="0" distL="0" distR="0" wp14:anchorId="2624C667" wp14:editId="6BDC159D">
+            <wp:extent cx="5472000" cy="4338466"/>
             <wp:effectExtent l="0" t="0" r="0" b="0"/>
-            <wp:docPr id="2" name="Picture 2" descr="Elm-SVG der gestapelten Erzeugungszeitreihe"/>
+            <wp:docPr id="2" name="Picture 2" descr="Elm-SVG der absoluten Erzeugungsleistung mit separatem Stromflussdiagramm"/>
             <wp:cNvGraphicFramePr>
               <a:graphicFrameLocks xmlns:a="http://schemas.openxmlformats.org/drawingml/2006/main" noChangeAspect="1"/>
             </wp:cNvGraphicFramePr>
@@ -1322,7 +1289,7 @@
                   <pic:spPr>
                     <a:xfrm>
                       <a:off x="0" y="0"/>
-                      <a:ext cx="5472000" cy="3627331"/>
+                      <a:ext cx="5472000" cy="4338466"/>
                     </a:xfrm>
                     <a:prstGeom prst="rect">
                       <a:avLst/>
@@ -1340,13 +1307,39 @@
         <w:pStyle w:val="Beschriftung"/>
         <w:jc w:val="left"/>
       </w:pPr>
+      <w:proofErr w:type="spellStart"/>
       <w:r>
-        <w:t>Abbildung 2: Gestapelte Erzeugungszeitreihe aus Elm. Die violette Linie zeigt das ausgewählte Länderpaar, die gestrichelte Linie den gewählten Zeitpunkt.</w:t>
+        <w:t>Abbildung</w:t>
+      </w:r>
+      <w:proofErr w:type="spellEnd"/>
+      <w:r>
+        <w:t xml:space="preserve"> 2: </w:t>
+      </w:r>
+      <w:proofErr w:type="spellStart"/>
+      <w:r>
+        <w:t>Erzeugungszeitreihe</w:t>
+      </w:r>
+      <w:proofErr w:type="spellEnd"/>
+      <w:r>
+        <w:t xml:space="preserve"> </w:t>
+      </w:r>
+      <w:proofErr w:type="spellStart"/>
+      <w:r>
+        <w:t>aus</w:t>
+      </w:r>
+      <w:proofErr w:type="spellEnd"/>
+      <w:r>
+        <w:t xml:space="preserve"> Elm. Die obere Y-Achse zeigt die absolute Erzeugungsleistung in GW. Der physische Fluss zu Frankreich wird darunter mit eigener symmetrischer GW-Achse dargestellt; die gestrichelte Linie markiert den gewählten Zeitpunkt.</w:t>
       </w:r>
     </w:p>
     <w:p>
       <w:r>
-        <w:t>Die Flächen zeigen Erneuerbare, Kohle, Gas und Sonstige. Für das ausgewählte Partnerland wird eine zusätzliche Flusslinie eingeblendet. Die Linie dient der zeitlichen Formanalyse; wegen der anderen Skala ist sie nicht als Bestandteil des Erzeugungsstapels zu lesen.</w:t>
+        <w:t>Die gestapelten Flächen zeigen absolute Leistungen für Erneuerbare, Kohle, Gas und Sonstige. Teilstriche und Achsenbeschriftung machen die Größenordnung in GW ablesbar. Unterhalb des Erzeugungsmixes besitzt der physische Stromfluss des ausgewählten Partnerlands ein separates Diagramm mit eigener symmetrischer Skala um null. Dadurch werden Stromfluss und Erzeugungsleistung nicht fälschlich auf derselben Y-Skala verglichen.</w:t>
+      </w:r>
+    </w:p>
+    <w:p>
+      <w:r>
+        <w:t>Für die ausgewählte Stunde zeigt die Anwendung Gesamtleistung, absolute Werte und prozentuale Anteile der vier Erzeugungsgruppen. Zusätzlich werden Strompreis und physischer Fluss des gewählten Partnerlands numerisch ausgegeben. Damit unterstützt die Ansicht sowohl die Mustererkennung im Verlauf als auch das Ablesen konkreter Einzelwerte.</w:t>
       </w:r>
     </w:p>
     <w:p>
@@ -1368,7 +1361,7 @@
           <w:noProof/>
         </w:rPr>
         <w:drawing>
-          <wp:inline distT="0" distB="0" distL="0" distR="0" wp14:anchorId="397052D5" wp14:editId="252675D2">
+          <wp:inline distT="0" distB="0" distL="0" distR="0" wp14:anchorId="75360AB6" wp14:editId="3545F0DD">
             <wp:extent cx="5760000" cy="2612588"/>
             <wp:effectExtent l="0" t="0" r="0" b="0"/>
             <wp:docPr id="3" name="Picture 3" descr="Elm-SVG einer Pixelmatrix der Stromflüsse nach Partnerland und Stunde"/>
@@ -1441,7 +1434,15 @@
     </w:p>
     <w:p>
       <w:r>
-        <w:t>Der Prototyp wurde mit Elm 0.19.1 implementiert. elm make kompiliert den Stand erfolgreich nach public/elm.js. Die Anwendung lädt ihren Datensatz über Http.get. Darstellung und Interaktion werden ausschließlich durch Elm und SVG erzeugt; Python wird nicht für die Diagrammgeometrie verwendet.</w:t>
+        <w:t xml:space="preserve">Der Prototyp wurde mit Elm 0.19.1 implementiert. elm make kompiliert den Stand erfolgreich nach public/elm.js. Die Anwendung lädt ihren Datensatz über Http.get. Darstellung und Interaktion werden ausschließlich durch Elm und SVG </w:t>
+      </w:r>
+      <w:proofErr w:type="spellStart"/>
+      <w:r>
+        <w:t>erzeugt</w:t>
+      </w:r>
+      <w:proofErr w:type="spellEnd"/>
+      <w:r>
+        <w:t>.</w:t>
       </w:r>
     </w:p>
     <w:tbl>
@@ -1803,6 +1804,7 @@
     </w:p>
     <w:p>
       <w:r>
+        <w:lastRenderedPageBreak/>
         <w:t>Der Flow-Datentyp speichert den physischen Wert aus v_cbpf und den Handelswert aus v_cbet getrennt. Die gerichteten Kanten und die Pixelmatrix codieren den physischen Fluss. Ein SVG-Tooltip der Flussansicht zeigt zusätzlich beide Zahlenwerte für das gewählte Länderpaar.</w:t>
       </w:r>
     </w:p>
@@ -1908,7 +1910,7 @@
     </w:p>
     <w:p>
       <w:r>
-        <w:t>Anschließend wurde die 24. Stunde der Zeitreihe gewählt. Der gemeinsame Zeitpunkt wechselte auf 02.01. 00 h, während France als Partnerauswahl erhalten blieb. Die gestrichelte Markierung, die Chord-Werte und die Matrixauswahl wurden aus demselben selectedIndex abgeleitet.</w:t>
+        <w:t>Anschließend wurde in der Zeitreihe der Zeitpunkt 02.01. 00 h angeklickt. Dieser Zeitpunkt besitzt im nullbasierten Datensatz den selectedIndex 24. France blieb als Partnerauswahl erhalten. Die gestrichelte Markierung, die Chord-Werte und die Matrixauswahl wurden aus demselben Index abgeleitet. Die Detailanzeige wies für diesen Zeitpunkt 60,2 GW Gesamtleistung sowie die absoluten und prozentualen Beiträge der Erzeugungsgruppen aus; der Frankreich-Fluss betrug +0,2 GW.</w:t>
       </w:r>
     </w:p>
     <w:p>
@@ -2177,7 +2179,7 @@
               <w:rPr>
                 <w:sz w:val="17"/>
               </w:rPr>
-              <w:t>gemeinsamer selectedIndex aktualisiert</w:t>
+              <w:t>selectedIndex, GW-Detailwerte und Anteilsausgabe aktualisiert</w:t>
             </w:r>
           </w:p>
         </w:tc>
@@ -2324,10 +2326,16 @@
       </w:pPr>
       <w:r>
         <w:lastRenderedPageBreak/>
-        <w:t>GitHub Link</w:t>
+        <w:t>GitHub</w:t>
       </w:r>
     </w:p>
     <w:p>
+      <w:r>
+        <w:t xml:space="preserve">Das Repository enthält Bericht, Elm-Quellcode, Builddateien, Datenprüfung, Experimente und Markdown-Dokumentation. </w:t>
+      </w:r>
+      <w:r>
+        <w:br/>
+      </w:r>
       <w:hyperlink r:id="rId11" w:history="1">
         <w:r>
           <w:rPr>
@@ -2345,13 +2353,8 @@
         <w:pStyle w:val="berschrift2"/>
       </w:pPr>
       <w:r>
-        <w:t>KI-</w:t>
+        <w:t>KI-Unterstützung</w:t>
       </w:r>
-      <w:proofErr w:type="spellStart"/>
-      <w:r>
-        <w:t>Unterstützung</w:t>
-      </w:r>
-      <w:proofErr w:type="spellEnd"/>
     </w:p>
     <w:p>
       <w:proofErr w:type="spellStart"/>
@@ -2360,14 +2363,19 @@
       </w:r>
       <w:proofErr w:type="spellEnd"/>
       <w:r>
-        <w:t xml:space="preserve">, Formulierung und Codeerstellung </w:t>
+        <w:t xml:space="preserve">, Formulierung und </w:t>
+      </w:r>
+      <w:proofErr w:type="spellStart"/>
+      <w:r>
+        <w:t>Codeerstellung</w:t>
+      </w:r>
+      <w:proofErr w:type="spellEnd"/>
+      <w:r>
+        <w:t xml:space="preserve"> </w:t>
       </w:r>
       <w:proofErr w:type="spellStart"/>
       <w:r>
         <w:t>wurde</w:t>
-      </w:r>
-      <w:r>
-        <w:t>n</w:t>
       </w:r>
       <w:proofErr w:type="spellEnd"/>
       <w:r>
@@ -2379,15 +2387,7 @@
       </w:r>
       <w:proofErr w:type="spellEnd"/>
       <w:r>
-        <w:t xml:space="preserve"> KI </w:t>
-      </w:r>
-      <w:proofErr w:type="spellStart"/>
-      <w:r>
-        <w:t>Werkzeuge</w:t>
-      </w:r>
-      <w:proofErr w:type="spellEnd"/>
-      <w:r>
-        <w:t xml:space="preserve"> </w:t>
+        <w:t xml:space="preserve"> KI (ChatGPT) </w:t>
       </w:r>
       <w:proofErr w:type="spellStart"/>
       <w:r>
@@ -2823,31 +2823,31 @@
       </w:rPr>
     </w:lvl>
   </w:abstractNum>
-  <w:num w:numId="1" w16cid:durableId="870725651">
+  <w:num w:numId="1" w16cid:durableId="349456419">
     <w:abstractNumId w:val="8"/>
   </w:num>
-  <w:num w:numId="2" w16cid:durableId="1083798077">
+  <w:num w:numId="2" w16cid:durableId="976955764">
     <w:abstractNumId w:val="6"/>
   </w:num>
-  <w:num w:numId="3" w16cid:durableId="1781949710">
+  <w:num w:numId="3" w16cid:durableId="1055855437">
     <w:abstractNumId w:val="5"/>
   </w:num>
-  <w:num w:numId="4" w16cid:durableId="1100686560">
+  <w:num w:numId="4" w16cid:durableId="2145001381">
     <w:abstractNumId w:val="4"/>
   </w:num>
-  <w:num w:numId="5" w16cid:durableId="184907866">
+  <w:num w:numId="5" w16cid:durableId="742223292">
     <w:abstractNumId w:val="7"/>
   </w:num>
-  <w:num w:numId="6" w16cid:durableId="703794584">
+  <w:num w:numId="6" w16cid:durableId="1597209794">
     <w:abstractNumId w:val="3"/>
   </w:num>
-  <w:num w:numId="7" w16cid:durableId="2120879885">
+  <w:num w:numId="7" w16cid:durableId="1332291383">
     <w:abstractNumId w:val="2"/>
   </w:num>
-  <w:num w:numId="8" w16cid:durableId="309139373">
+  <w:num w:numId="8" w16cid:durableId="1957056907">
     <w:abstractNumId w:val="1"/>
   </w:num>
-  <w:num w:numId="9" w16cid:durableId="1568421614">
+  <w:num w:numId="9" w16cid:durableId="813105641">
     <w:abstractNumId w:val="0"/>
   </w:num>
 </w:numbering>
@@ -14252,7 +14252,7 @@
     <w:basedOn w:val="Absatz-Standardschriftart"/>
     <w:uiPriority w:val="99"/>
     <w:unhideWhenUsed/>
-    <w:rsid w:val="00835731"/>
+    <w:rsid w:val="00D766C2"/>
     <w:rPr>
       <w:color w:val="0000FF" w:themeColor="hyperlink"/>
       <w:u w:val="single"/>
@@ -14264,7 +14264,7 @@
     <w:uiPriority w:val="99"/>
     <w:semiHidden/>
     <w:unhideWhenUsed/>
-    <w:rsid w:val="00835731"/>
+    <w:rsid w:val="00D766C2"/>
     <w:rPr>
       <w:color w:val="605E5C"/>
       <w:shd w:val="clear" w:color="auto" w:fill="E1DFDD"/>

</xml_diff>